<commit_message>
Fix: Update document formatting and clarify problem description in Tarea01.docx
</commit_message>
<xml_diff>
--- a/Documentacion/Tarea01.docx
+++ b/Documentacion/Tarea01.docx
@@ -50,11 +50,12 @@
           <w:sz w:val="32"/>
           <w:szCs w:val="32"/>
         </w:rPr>
-        <w:t>Compiladores e Intérpretes Grupo 60</w:t>
-      </w:r>
-    </w:p>
-    <w:p>
-      <w:pPr>
+        <w:t>Compiladores e Intérpretes</w:t>
+      </w:r>
+    </w:p>
+    <w:p>
+      <w:pPr>
+        <w:jc w:val="center"/>
         <w:rPr>
           <w:b/>
           <w:bCs/>
@@ -62,41 +63,38 @@
           <w:szCs w:val="32"/>
         </w:rPr>
       </w:pPr>
-    </w:p>
-    <w:p>
-      <w:pPr>
-        <w:jc w:val="center"/>
+      <w:r>
         <w:rPr>
           <w:b/>
           <w:bCs/>
           <w:sz w:val="32"/>
           <w:szCs w:val="32"/>
         </w:rPr>
-      </w:pPr>
-      <w:r>
+        <w:t xml:space="preserve"> </w:t>
+      </w:r>
+    </w:p>
+    <w:p>
+      <w:pPr>
+        <w:jc w:val="center"/>
         <w:rPr>
           <w:b/>
           <w:bCs/>
           <w:sz w:val="32"/>
           <w:szCs w:val="32"/>
         </w:rPr>
-        <w:t>Profesor: Allan Rodríguez Dávila</w:t>
-      </w:r>
-    </w:p>
-    <w:p>
-      <w:pPr>
-        <w:jc w:val="center"/>
+      </w:pPr>
+      <w:r>
         <w:rPr>
           <w:b/>
           <w:bCs/>
           <w:sz w:val="32"/>
           <w:szCs w:val="32"/>
         </w:rPr>
-      </w:pPr>
-    </w:p>
-    <w:p>
-      <w:pPr>
-        <w:jc w:val="center"/>
+        <w:t>Grupo 60</w:t>
+      </w:r>
+    </w:p>
+    <w:p>
+      <w:pPr>
         <w:rPr>
           <w:b/>
           <w:bCs/>
@@ -104,15 +102,17 @@
           <w:szCs w:val="32"/>
         </w:rPr>
       </w:pPr>
-      <w:r>
+    </w:p>
+    <w:p>
+      <w:pPr>
+        <w:jc w:val="center"/>
         <w:rPr>
           <w:b/>
           <w:bCs/>
           <w:sz w:val="32"/>
           <w:szCs w:val="32"/>
         </w:rPr>
-        <w:t>Tarea #1:</w:t>
-      </w:r>
+      </w:pPr>
       <w:r>
         <w:rPr>
           <w:b/>
@@ -120,8 +120,7 @@
           <w:sz w:val="32"/>
           <w:szCs w:val="32"/>
         </w:rPr>
-        <w:br/>
-        <w:t>Gramática BNF</w:t>
+        <w:t>Profesor: Allan Rodríguez Dávila</w:t>
       </w:r>
     </w:p>
     <w:p>
@@ -145,17 +144,15 @@
           <w:szCs w:val="32"/>
         </w:rPr>
       </w:pPr>
-    </w:p>
-    <w:p>
-      <w:pPr>
-        <w:jc w:val="center"/>
+      <w:r>
         <w:rPr>
           <w:b/>
           <w:bCs/>
           <w:sz w:val="32"/>
           <w:szCs w:val="32"/>
         </w:rPr>
-      </w:pPr>
+        <w:t>Tarea #1:</w:t>
+      </w:r>
       <w:r>
         <w:rPr>
           <w:b/>
@@ -163,7 +160,8 @@
           <w:sz w:val="32"/>
           <w:szCs w:val="32"/>
         </w:rPr>
-        <w:t>Estudiante: Luis Carlos Trejos Rivera</w:t>
+        <w:br/>
+        <w:t>Gramática BNF</w:t>
       </w:r>
     </w:p>
     <w:p>
@@ -187,26 +185,26 @@
           <w:szCs w:val="32"/>
         </w:rPr>
       </w:pPr>
-      <w:r>
+    </w:p>
+    <w:p>
+      <w:pPr>
+        <w:jc w:val="center"/>
         <w:rPr>
           <w:b/>
           <w:bCs/>
           <w:sz w:val="32"/>
           <w:szCs w:val="32"/>
         </w:rPr>
-        <w:t>Semestre II, 2026</w:t>
-      </w:r>
-    </w:p>
-    <w:p>
-      <w:pPr>
-        <w:jc w:val="center"/>
+      </w:pPr>
+      <w:r>
         <w:rPr>
           <w:b/>
           <w:bCs/>
           <w:sz w:val="32"/>
           <w:szCs w:val="32"/>
         </w:rPr>
-      </w:pPr>
+        <w:t>Estudiante: Luis Carlos Trejos Rivera</w:t>
+      </w:r>
     </w:p>
     <w:p>
       <w:pPr>
@@ -218,32 +216,74 @@
           <w:szCs w:val="32"/>
         </w:rPr>
       </w:pPr>
-      <w:r>
+    </w:p>
+    <w:p>
+      <w:pPr>
+        <w:jc w:val="center"/>
         <w:rPr>
           <w:b/>
           <w:bCs/>
           <w:sz w:val="32"/>
           <w:szCs w:val="32"/>
         </w:rPr>
-        <w:t>Fecha de entrega: 11 de septiembre de 2026</w:t>
-      </w:r>
-    </w:p>
-    <w:p>
-      <w:pPr>
+      </w:pPr>
+      <w:r>
         <w:rPr>
           <w:b/>
           <w:bCs/>
           <w:sz w:val="32"/>
           <w:szCs w:val="32"/>
         </w:rPr>
-      </w:pPr>
-      <w:r>
+        <w:t>Semestre II, 2026</w:t>
+      </w:r>
+    </w:p>
+    <w:p>
+      <w:pPr>
+        <w:jc w:val="center"/>
         <w:rPr>
           <w:b/>
           <w:bCs/>
           <w:sz w:val="32"/>
           <w:szCs w:val="32"/>
         </w:rPr>
+      </w:pPr>
+    </w:p>
+    <w:p>
+      <w:pPr>
+        <w:jc w:val="center"/>
+        <w:rPr>
+          <w:b/>
+          <w:bCs/>
+          <w:sz w:val="32"/>
+          <w:szCs w:val="32"/>
+        </w:rPr>
+      </w:pPr>
+      <w:r>
+        <w:rPr>
+          <w:b/>
+          <w:bCs/>
+          <w:sz w:val="32"/>
+          <w:szCs w:val="32"/>
+        </w:rPr>
+        <w:t>Fecha de entrega: 11 de septiembre de 2026</w:t>
+      </w:r>
+    </w:p>
+    <w:p>
+      <w:pPr>
+        <w:rPr>
+          <w:b/>
+          <w:bCs/>
+          <w:sz w:val="32"/>
+          <w:szCs w:val="32"/>
+        </w:rPr>
+      </w:pPr>
+      <w:r>
+        <w:rPr>
+          <w:b/>
+          <w:bCs/>
+          <w:sz w:val="32"/>
+          <w:szCs w:val="32"/>
+        </w:rPr>
         <w:br w:type="page"/>
       </w:r>
     </w:p>
@@ -270,7 +310,21 @@
           <w:sz w:val="24"/>
           <w:szCs w:val="24"/>
         </w:rPr>
-        <w:t>Se solicitó diseñar una gramática BNF para un lenguaje de programación imperativo orientado a la configuración de chips y sistemas empotrados. El lenguaje debía soportar tipos de datos básicos, arreglos estáticos unidimensionales, expresiones aritméticas con precedencia, expresiones relacionales y lógicas, estructuras de control, funciones, entrada/salida estándar y comentarios. Además, debe definir un procedimiento principal llamado principal como punto de entrada del programa.</w:t>
+        <w:t>Se solicitó diseñar una gramática BNF para un lenguaje de programación imperativo orientado a la configuración de chips y sistemas empotrados. El lenguaje deb</w:t>
+      </w:r>
+      <w:r>
+        <w:rPr>
+          <w:sz w:val="24"/>
+          <w:szCs w:val="24"/>
+        </w:rPr>
+        <w:t>e</w:t>
+      </w:r>
+      <w:r>
+        <w:rPr>
+          <w:sz w:val="24"/>
+          <w:szCs w:val="24"/>
+        </w:rPr>
+        <w:t xml:space="preserve"> soportar tipos de datos básicos, arreglos estáticos unidimensionales, expresiones aritméticas con precedencia, expresiones relacionales y lógicas, estructuras de control, funciones, entrada/salida estándar y comentarios. Además, debe definir un procedimiento principal llamado principal como punto de entrada del programa.</w:t>
       </w:r>
     </w:p>
     <w:p>
@@ -977,7 +1031,7 @@
         <w:tblLook w:val="04A0" w:firstRow="1" w:lastRow="0" w:firstColumn="1" w:lastColumn="0" w:noHBand="0" w:noVBand="1"/>
       </w:tblPr>
       <w:tblGrid>
-        <w:gridCol w:w="2141"/>
+        <w:gridCol w:w="2148"/>
         <w:gridCol w:w="4951"/>
       </w:tblGrid>
       <w:tr>
@@ -994,8 +1048,16 @@
             <w:pPr>
               <w:spacing w:after="160" w:line="259" w:lineRule="auto"/>
               <w:jc w:val="left"/>
-            </w:pPr>
-            <w:r>
+              <w:rPr>
+                <w:i w:val="0"/>
+                <w:iCs w:val="0"/>
+              </w:rPr>
+            </w:pPr>
+            <w:r>
+              <w:rPr>
+                <w:i w:val="0"/>
+                <w:iCs w:val="0"/>
+              </w:rPr>
               <w:t>No Terminal</w:t>
             </w:r>
           </w:p>
@@ -1009,16 +1071,8 @@
             <w:pPr>
               <w:spacing w:after="160" w:line="259" w:lineRule="auto"/>
               <w:cnfStyle w:val="100000000000" w:firstRow="1" w:lastRow="0" w:firstColumn="0" w:lastColumn="0" w:oddVBand="0" w:evenVBand="0" w:oddHBand="0" w:evenHBand="0" w:firstRowFirstColumn="0" w:firstRowLastColumn="0" w:lastRowFirstColumn="0" w:lastRowLastColumn="0"/>
-              <w:rPr>
-                <w:i/>
-                <w:iCs/>
-              </w:rPr>
-            </w:pPr>
-            <w:r>
-              <w:rPr>
-                <w:i/>
-                <w:iCs/>
-              </w:rPr>
+            </w:pPr>
+            <w:r>
               <w:t>Descripción</w:t>
             </w:r>
           </w:p>
@@ -1037,8 +1091,16 @@
           <w:p>
             <w:pPr>
               <w:spacing w:after="160" w:line="259" w:lineRule="auto"/>
-            </w:pPr>
-            <w:r>
+              <w:rPr>
+                <w:i w:val="0"/>
+                <w:iCs w:val="0"/>
+              </w:rPr>
+            </w:pPr>
+            <w:r>
+              <w:rPr>
+                <w:i w:val="0"/>
+                <w:iCs w:val="0"/>
+              </w:rPr>
               <w:t>&lt;programa&gt;</w:t>
             </w:r>
           </w:p>
@@ -1069,16 +1131,32 @@
           <w:p>
             <w:pPr>
               <w:spacing w:after="160" w:line="259" w:lineRule="auto"/>
-            </w:pPr>
-            <w:r>
+              <w:rPr>
+                <w:i w:val="0"/>
+                <w:iCs w:val="0"/>
+              </w:rPr>
+            </w:pPr>
+            <w:r>
+              <w:rPr>
+                <w:i w:val="0"/>
+                <w:iCs w:val="0"/>
+              </w:rPr>
               <w:t>&lt;</w:t>
             </w:r>
             <w:proofErr w:type="spellStart"/>
             <w:r>
+              <w:rPr>
+                <w:i w:val="0"/>
+                <w:iCs w:val="0"/>
+              </w:rPr>
               <w:t>globalesOpc</w:t>
             </w:r>
             <w:proofErr w:type="spellEnd"/>
             <w:r>
+              <w:rPr>
+                <w:i w:val="0"/>
+                <w:iCs w:val="0"/>
+              </w:rPr>
               <w:t>&gt;</w:t>
             </w:r>
           </w:p>
@@ -1112,16 +1190,32 @@
           <w:p>
             <w:pPr>
               <w:spacing w:after="160" w:line="259" w:lineRule="auto"/>
-            </w:pPr>
-            <w:r>
+              <w:rPr>
+                <w:i w:val="0"/>
+                <w:iCs w:val="0"/>
+              </w:rPr>
+            </w:pPr>
+            <w:r>
+              <w:rPr>
+                <w:i w:val="0"/>
+                <w:iCs w:val="0"/>
+              </w:rPr>
               <w:t>&lt;</w:t>
             </w:r>
             <w:proofErr w:type="spellStart"/>
             <w:r>
+              <w:rPr>
+                <w:i w:val="0"/>
+                <w:iCs w:val="0"/>
+              </w:rPr>
               <w:t>funcionesOpc</w:t>
             </w:r>
             <w:proofErr w:type="spellEnd"/>
             <w:r>
+              <w:rPr>
+                <w:i w:val="0"/>
+                <w:iCs w:val="0"/>
+              </w:rPr>
               <w:t>&gt;</w:t>
             </w:r>
           </w:p>
@@ -1152,8 +1246,16 @@
           <w:p>
             <w:pPr>
               <w:spacing w:after="160" w:line="259" w:lineRule="auto"/>
-            </w:pPr>
-            <w:r>
+              <w:rPr>
+                <w:i w:val="0"/>
+                <w:iCs w:val="0"/>
+              </w:rPr>
+            </w:pPr>
+            <w:r>
+              <w:rPr>
+                <w:i w:val="0"/>
+                <w:iCs w:val="0"/>
+              </w:rPr>
               <w:t>&lt;identificador&gt;</w:t>
             </w:r>
           </w:p>
@@ -1187,8 +1289,16 @@
           <w:p>
             <w:pPr>
               <w:spacing w:after="160" w:line="259" w:lineRule="auto"/>
-            </w:pPr>
-            <w:r>
+              <w:rPr>
+                <w:i w:val="0"/>
+                <w:iCs w:val="0"/>
+              </w:rPr>
+            </w:pPr>
+            <w:r>
+              <w:rPr>
+                <w:i w:val="0"/>
+                <w:iCs w:val="0"/>
+              </w:rPr>
               <w:t>&lt;tipo&gt;</w:t>
             </w:r>
           </w:p>
@@ -1219,8 +1329,16 @@
           <w:p>
             <w:pPr>
               <w:spacing w:after="160" w:line="259" w:lineRule="auto"/>
-            </w:pPr>
-            <w:r>
+              <w:rPr>
+                <w:i w:val="0"/>
+                <w:iCs w:val="0"/>
+              </w:rPr>
+            </w:pPr>
+            <w:r>
+              <w:rPr>
+                <w:i w:val="0"/>
+                <w:iCs w:val="0"/>
+              </w:rPr>
               <w:t>&lt;literal&gt;</w:t>
             </w:r>
           </w:p>
@@ -1254,16 +1372,32 @@
           <w:p>
             <w:pPr>
               <w:spacing w:after="160" w:line="259" w:lineRule="auto"/>
-            </w:pPr>
-            <w:r>
+              <w:rPr>
+                <w:i w:val="0"/>
+                <w:iCs w:val="0"/>
+              </w:rPr>
+            </w:pPr>
+            <w:r>
+              <w:rPr>
+                <w:i w:val="0"/>
+                <w:iCs w:val="0"/>
+              </w:rPr>
               <w:t>&lt;</w:t>
             </w:r>
             <w:proofErr w:type="spellStart"/>
             <w:r>
+              <w:rPr>
+                <w:i w:val="0"/>
+                <w:iCs w:val="0"/>
+              </w:rPr>
               <w:t>literalInt</w:t>
             </w:r>
             <w:proofErr w:type="spellEnd"/>
             <w:r>
+              <w:rPr>
+                <w:i w:val="0"/>
+                <w:iCs w:val="0"/>
+              </w:rPr>
               <w:t>&gt;</w:t>
             </w:r>
           </w:p>
@@ -1294,16 +1428,32 @@
           <w:p>
             <w:pPr>
               <w:spacing w:after="160" w:line="259" w:lineRule="auto"/>
-            </w:pPr>
-            <w:r>
+              <w:rPr>
+                <w:i w:val="0"/>
+                <w:iCs w:val="0"/>
+              </w:rPr>
+            </w:pPr>
+            <w:r>
+              <w:rPr>
+                <w:i w:val="0"/>
+                <w:iCs w:val="0"/>
+              </w:rPr>
               <w:t>&lt;</w:t>
             </w:r>
             <w:proofErr w:type="spellStart"/>
             <w:r>
+              <w:rPr>
+                <w:i w:val="0"/>
+                <w:iCs w:val="0"/>
+              </w:rPr>
               <w:t>literalFloat</w:t>
             </w:r>
             <w:proofErr w:type="spellEnd"/>
             <w:r>
+              <w:rPr>
+                <w:i w:val="0"/>
+                <w:iCs w:val="0"/>
+              </w:rPr>
               <w:t>&gt;</w:t>
             </w:r>
           </w:p>
@@ -1337,16 +1487,32 @@
           <w:p>
             <w:pPr>
               <w:spacing w:after="160" w:line="259" w:lineRule="auto"/>
-            </w:pPr>
-            <w:r>
+              <w:rPr>
+                <w:i w:val="0"/>
+                <w:iCs w:val="0"/>
+              </w:rPr>
+            </w:pPr>
+            <w:r>
+              <w:rPr>
+                <w:i w:val="0"/>
+                <w:iCs w:val="0"/>
+              </w:rPr>
               <w:t>&lt;</w:t>
             </w:r>
             <w:proofErr w:type="spellStart"/>
             <w:r>
+              <w:rPr>
+                <w:i w:val="0"/>
+                <w:iCs w:val="0"/>
+              </w:rPr>
               <w:t>literalBool</w:t>
             </w:r>
             <w:proofErr w:type="spellEnd"/>
             <w:r>
+              <w:rPr>
+                <w:i w:val="0"/>
+                <w:iCs w:val="0"/>
+              </w:rPr>
               <w:t>&gt;</w:t>
             </w:r>
           </w:p>
@@ -1377,16 +1543,32 @@
           <w:p>
             <w:pPr>
               <w:spacing w:after="160" w:line="259" w:lineRule="auto"/>
-            </w:pPr>
-            <w:r>
+              <w:rPr>
+                <w:i w:val="0"/>
+                <w:iCs w:val="0"/>
+              </w:rPr>
+            </w:pPr>
+            <w:r>
+              <w:rPr>
+                <w:i w:val="0"/>
+                <w:iCs w:val="0"/>
+              </w:rPr>
               <w:t>&lt;</w:t>
             </w:r>
             <w:proofErr w:type="spellStart"/>
             <w:r>
+              <w:rPr>
+                <w:i w:val="0"/>
+                <w:iCs w:val="0"/>
+              </w:rPr>
               <w:t>literalChar</w:t>
             </w:r>
             <w:proofErr w:type="spellEnd"/>
             <w:r>
+              <w:rPr>
+                <w:i w:val="0"/>
+                <w:iCs w:val="0"/>
+              </w:rPr>
               <w:t>&gt;</w:t>
             </w:r>
           </w:p>
@@ -1420,16 +1602,32 @@
           <w:p>
             <w:pPr>
               <w:spacing w:after="160" w:line="259" w:lineRule="auto"/>
-            </w:pPr>
-            <w:r>
+              <w:rPr>
+                <w:i w:val="0"/>
+                <w:iCs w:val="0"/>
+              </w:rPr>
+            </w:pPr>
+            <w:r>
+              <w:rPr>
+                <w:i w:val="0"/>
+                <w:iCs w:val="0"/>
+              </w:rPr>
               <w:t>&lt;</w:t>
             </w:r>
             <w:proofErr w:type="spellStart"/>
             <w:r>
+              <w:rPr>
+                <w:i w:val="0"/>
+                <w:iCs w:val="0"/>
+              </w:rPr>
               <w:t>literalStr</w:t>
             </w:r>
             <w:proofErr w:type="spellEnd"/>
             <w:r>
+              <w:rPr>
+                <w:i w:val="0"/>
+                <w:iCs w:val="0"/>
+              </w:rPr>
               <w:t>&gt;</w:t>
             </w:r>
           </w:p>
@@ -1460,16 +1658,32 @@
           <w:p>
             <w:pPr>
               <w:spacing w:after="160" w:line="259" w:lineRule="auto"/>
-            </w:pPr>
-            <w:r>
+              <w:rPr>
+                <w:i w:val="0"/>
+                <w:iCs w:val="0"/>
+              </w:rPr>
+            </w:pPr>
+            <w:r>
+              <w:rPr>
+                <w:i w:val="0"/>
+                <w:iCs w:val="0"/>
+              </w:rPr>
               <w:t>&lt;</w:t>
             </w:r>
             <w:proofErr w:type="spellStart"/>
             <w:r>
+              <w:rPr>
+                <w:i w:val="0"/>
+                <w:iCs w:val="0"/>
+              </w:rPr>
               <w:t>literalListInt</w:t>
             </w:r>
             <w:proofErr w:type="spellEnd"/>
             <w:r>
+              <w:rPr>
+                <w:i w:val="0"/>
+                <w:iCs w:val="0"/>
+              </w:rPr>
               <w:t>&gt;</w:t>
             </w:r>
           </w:p>
@@ -1503,16 +1717,32 @@
           <w:p>
             <w:pPr>
               <w:spacing w:after="160" w:line="259" w:lineRule="auto"/>
-            </w:pPr>
-            <w:r>
+              <w:rPr>
+                <w:i w:val="0"/>
+                <w:iCs w:val="0"/>
+              </w:rPr>
+            </w:pPr>
+            <w:r>
+              <w:rPr>
+                <w:i w:val="0"/>
+                <w:iCs w:val="0"/>
+              </w:rPr>
               <w:t>&lt;</w:t>
             </w:r>
             <w:proofErr w:type="spellStart"/>
             <w:r>
+              <w:rPr>
+                <w:i w:val="0"/>
+                <w:iCs w:val="0"/>
+              </w:rPr>
               <w:t>literalListFloat</w:t>
             </w:r>
             <w:proofErr w:type="spellEnd"/>
             <w:r>
+              <w:rPr>
+                <w:i w:val="0"/>
+                <w:iCs w:val="0"/>
+              </w:rPr>
               <w:t>&gt;</w:t>
             </w:r>
           </w:p>
@@ -1543,16 +1773,32 @@
           <w:p>
             <w:pPr>
               <w:spacing w:after="160" w:line="259" w:lineRule="auto"/>
-            </w:pPr>
-            <w:r>
+              <w:rPr>
+                <w:i w:val="0"/>
+                <w:iCs w:val="0"/>
+              </w:rPr>
+            </w:pPr>
+            <w:r>
+              <w:rPr>
+                <w:i w:val="0"/>
+                <w:iCs w:val="0"/>
+              </w:rPr>
               <w:t>&lt;</w:t>
             </w:r>
             <w:proofErr w:type="spellStart"/>
             <w:r>
+              <w:rPr>
+                <w:i w:val="0"/>
+                <w:iCs w:val="0"/>
+              </w:rPr>
               <w:t>declaracion</w:t>
             </w:r>
             <w:proofErr w:type="spellEnd"/>
             <w:r>
+              <w:rPr>
+                <w:i w:val="0"/>
+                <w:iCs w:val="0"/>
+              </w:rPr>
               <w:t>&gt;</w:t>
             </w:r>
           </w:p>
@@ -1586,16 +1832,32 @@
           <w:p>
             <w:pPr>
               <w:spacing w:after="160" w:line="259" w:lineRule="auto"/>
-            </w:pPr>
-            <w:r>
+              <w:rPr>
+                <w:i w:val="0"/>
+                <w:iCs w:val="0"/>
+              </w:rPr>
+            </w:pPr>
+            <w:r>
+              <w:rPr>
+                <w:i w:val="0"/>
+                <w:iCs w:val="0"/>
+              </w:rPr>
               <w:t>&lt;</w:t>
             </w:r>
             <w:proofErr w:type="spellStart"/>
             <w:r>
+              <w:rPr>
+                <w:i w:val="0"/>
+                <w:iCs w:val="0"/>
+              </w:rPr>
               <w:t>declaracionList</w:t>
             </w:r>
             <w:proofErr w:type="spellEnd"/>
             <w:r>
+              <w:rPr>
+                <w:i w:val="0"/>
+                <w:iCs w:val="0"/>
+              </w:rPr>
               <w:t>&gt;</w:t>
             </w:r>
           </w:p>
@@ -1626,16 +1888,32 @@
           <w:p>
             <w:pPr>
               <w:spacing w:after="160" w:line="259" w:lineRule="auto"/>
-            </w:pPr>
-            <w:r>
+              <w:rPr>
+                <w:i w:val="0"/>
+                <w:iCs w:val="0"/>
+              </w:rPr>
+            </w:pPr>
+            <w:r>
+              <w:rPr>
+                <w:i w:val="0"/>
+                <w:iCs w:val="0"/>
+              </w:rPr>
               <w:t>&lt;</w:t>
             </w:r>
             <w:proofErr w:type="spellStart"/>
             <w:r>
+              <w:rPr>
+                <w:i w:val="0"/>
+                <w:iCs w:val="0"/>
+              </w:rPr>
               <w:t>exprArit</w:t>
             </w:r>
             <w:proofErr w:type="spellEnd"/>
             <w:r>
+              <w:rPr>
+                <w:i w:val="0"/>
+                <w:iCs w:val="0"/>
+              </w:rPr>
               <w:t>&gt;</w:t>
             </w:r>
           </w:p>
@@ -1669,16 +1947,32 @@
           <w:p>
             <w:pPr>
               <w:spacing w:after="160" w:line="259" w:lineRule="auto"/>
-            </w:pPr>
-            <w:r>
+              <w:rPr>
+                <w:i w:val="0"/>
+                <w:iCs w:val="0"/>
+              </w:rPr>
+            </w:pPr>
+            <w:r>
+              <w:rPr>
+                <w:i w:val="0"/>
+                <w:iCs w:val="0"/>
+              </w:rPr>
               <w:t>&lt;</w:t>
             </w:r>
             <w:proofErr w:type="spellStart"/>
             <w:r>
+              <w:rPr>
+                <w:i w:val="0"/>
+                <w:iCs w:val="0"/>
+              </w:rPr>
               <w:t>term</w:t>
             </w:r>
             <w:proofErr w:type="spellEnd"/>
             <w:r>
+              <w:rPr>
+                <w:i w:val="0"/>
+                <w:iCs w:val="0"/>
+              </w:rPr>
               <w:t>&gt;</w:t>
             </w:r>
           </w:p>
@@ -1709,8 +2003,16 @@
           <w:p>
             <w:pPr>
               <w:spacing w:after="160" w:line="259" w:lineRule="auto"/>
-            </w:pPr>
-            <w:r>
+              <w:rPr>
+                <w:i w:val="0"/>
+                <w:iCs w:val="0"/>
+              </w:rPr>
+            </w:pPr>
+            <w:r>
+              <w:rPr>
+                <w:i w:val="0"/>
+                <w:iCs w:val="0"/>
+              </w:rPr>
               <w:t>&lt;factor&gt;</w:t>
             </w:r>
           </w:p>
@@ -1744,8 +2046,16 @@
           <w:p>
             <w:pPr>
               <w:spacing w:after="160" w:line="259" w:lineRule="auto"/>
-            </w:pPr>
-            <w:r>
+              <w:rPr>
+                <w:i w:val="0"/>
+                <w:iCs w:val="0"/>
+              </w:rPr>
+            </w:pPr>
+            <w:r>
+              <w:rPr>
+                <w:i w:val="0"/>
+                <w:iCs w:val="0"/>
+              </w:rPr>
               <w:t>&lt;potencia&gt;</w:t>
             </w:r>
           </w:p>
@@ -1776,16 +2086,32 @@
           <w:p>
             <w:pPr>
               <w:spacing w:after="160" w:line="259" w:lineRule="auto"/>
-            </w:pPr>
-            <w:r>
+              <w:rPr>
+                <w:i w:val="0"/>
+                <w:iCs w:val="0"/>
+              </w:rPr>
+            </w:pPr>
+            <w:r>
+              <w:rPr>
+                <w:i w:val="0"/>
+                <w:iCs w:val="0"/>
+              </w:rPr>
               <w:t>&lt;</w:t>
             </w:r>
             <w:proofErr w:type="spellStart"/>
             <w:r>
+              <w:rPr>
+                <w:i w:val="0"/>
+                <w:iCs w:val="0"/>
+              </w:rPr>
               <w:t>atomo</w:t>
             </w:r>
             <w:proofErr w:type="spellEnd"/>
             <w:r>
+              <w:rPr>
+                <w:i w:val="0"/>
+                <w:iCs w:val="0"/>
+              </w:rPr>
               <w:t>&gt;</w:t>
             </w:r>
           </w:p>
@@ -1819,16 +2145,32 @@
           <w:p>
             <w:pPr>
               <w:spacing w:after="160" w:line="259" w:lineRule="auto"/>
-            </w:pPr>
-            <w:r>
+              <w:rPr>
+                <w:i w:val="0"/>
+                <w:iCs w:val="0"/>
+              </w:rPr>
+            </w:pPr>
+            <w:r>
+              <w:rPr>
+                <w:i w:val="0"/>
+                <w:iCs w:val="0"/>
+              </w:rPr>
               <w:t>&lt;</w:t>
             </w:r>
             <w:proofErr w:type="spellStart"/>
             <w:r>
+              <w:rPr>
+                <w:i w:val="0"/>
+                <w:iCs w:val="0"/>
+              </w:rPr>
               <w:t>accesoList</w:t>
             </w:r>
             <w:proofErr w:type="spellEnd"/>
             <w:r>
+              <w:rPr>
+                <w:i w:val="0"/>
+                <w:iCs w:val="0"/>
+              </w:rPr>
               <w:t>&gt;</w:t>
             </w:r>
           </w:p>
@@ -1859,8 +2201,16 @@
           <w:p>
             <w:pPr>
               <w:spacing w:after="160" w:line="259" w:lineRule="auto"/>
-            </w:pPr>
-            <w:r>
+              <w:rPr>
+                <w:i w:val="0"/>
+                <w:iCs w:val="0"/>
+              </w:rPr>
+            </w:pPr>
+            <w:r>
+              <w:rPr>
+                <w:i w:val="0"/>
+                <w:iCs w:val="0"/>
+              </w:rPr>
               <w:t>&lt;negativo&gt;</w:t>
             </w:r>
           </w:p>
@@ -1894,16 +2244,32 @@
           <w:p>
             <w:pPr>
               <w:spacing w:after="160" w:line="259" w:lineRule="auto"/>
-            </w:pPr>
-            <w:r>
+              <w:rPr>
+                <w:i w:val="0"/>
+                <w:iCs w:val="0"/>
+              </w:rPr>
+            </w:pPr>
+            <w:r>
+              <w:rPr>
+                <w:i w:val="0"/>
+                <w:iCs w:val="0"/>
+              </w:rPr>
               <w:t>&lt;</w:t>
             </w:r>
             <w:proofErr w:type="spellStart"/>
             <w:r>
+              <w:rPr>
+                <w:i w:val="0"/>
+                <w:iCs w:val="0"/>
+              </w:rPr>
               <w:t>unarioSuma</w:t>
             </w:r>
             <w:proofErr w:type="spellEnd"/>
             <w:r>
+              <w:rPr>
+                <w:i w:val="0"/>
+                <w:iCs w:val="0"/>
+              </w:rPr>
               <w:t>&gt;</w:t>
             </w:r>
           </w:p>
@@ -1934,16 +2300,32 @@
           <w:p>
             <w:pPr>
               <w:spacing w:after="160" w:line="259" w:lineRule="auto"/>
-            </w:pPr>
-            <w:r>
+              <w:rPr>
+                <w:i w:val="0"/>
+                <w:iCs w:val="0"/>
+              </w:rPr>
+            </w:pPr>
+            <w:r>
+              <w:rPr>
+                <w:i w:val="0"/>
+                <w:iCs w:val="0"/>
+              </w:rPr>
               <w:t>&lt;</w:t>
             </w:r>
             <w:proofErr w:type="spellStart"/>
             <w:r>
+              <w:rPr>
+                <w:i w:val="0"/>
+                <w:iCs w:val="0"/>
+              </w:rPr>
               <w:t>unarioResta</w:t>
             </w:r>
             <w:proofErr w:type="spellEnd"/>
             <w:r>
+              <w:rPr>
+                <w:i w:val="0"/>
+                <w:iCs w:val="0"/>
+              </w:rPr>
               <w:t>&gt;</w:t>
             </w:r>
           </w:p>
@@ -1977,16 +2359,32 @@
           <w:p>
             <w:pPr>
               <w:spacing w:after="160" w:line="259" w:lineRule="auto"/>
-            </w:pPr>
-            <w:r>
+              <w:rPr>
+                <w:i w:val="0"/>
+                <w:iCs w:val="0"/>
+              </w:rPr>
+            </w:pPr>
+            <w:r>
+              <w:rPr>
+                <w:i w:val="0"/>
+                <w:iCs w:val="0"/>
+              </w:rPr>
               <w:t>&lt;</w:t>
             </w:r>
             <w:proofErr w:type="spellStart"/>
             <w:r>
+              <w:rPr>
+                <w:i w:val="0"/>
+                <w:iCs w:val="0"/>
+              </w:rPr>
               <w:t>exprRel</w:t>
             </w:r>
             <w:proofErr w:type="spellEnd"/>
             <w:r>
+              <w:rPr>
+                <w:i w:val="0"/>
+                <w:iCs w:val="0"/>
+              </w:rPr>
               <w:t>&gt;</w:t>
             </w:r>
           </w:p>
@@ -2017,16 +2415,32 @@
           <w:p>
             <w:pPr>
               <w:spacing w:after="160" w:line="259" w:lineRule="auto"/>
-            </w:pPr>
-            <w:r>
+              <w:rPr>
+                <w:i w:val="0"/>
+                <w:iCs w:val="0"/>
+              </w:rPr>
+            </w:pPr>
+            <w:r>
+              <w:rPr>
+                <w:i w:val="0"/>
+                <w:iCs w:val="0"/>
+              </w:rPr>
               <w:t>&lt;</w:t>
             </w:r>
             <w:proofErr w:type="spellStart"/>
             <w:r>
+              <w:rPr>
+                <w:i w:val="0"/>
+                <w:iCs w:val="0"/>
+              </w:rPr>
               <w:t>opRel</w:t>
             </w:r>
             <w:proofErr w:type="spellEnd"/>
             <w:r>
+              <w:rPr>
+                <w:i w:val="0"/>
+                <w:iCs w:val="0"/>
+              </w:rPr>
               <w:t>&gt;</w:t>
             </w:r>
           </w:p>
@@ -2060,17 +2474,33 @@
           <w:p>
             <w:pPr>
               <w:spacing w:after="160" w:line="259" w:lineRule="auto"/>
-            </w:pPr>
-            <w:r>
+              <w:rPr>
+                <w:i w:val="0"/>
+                <w:iCs w:val="0"/>
+              </w:rPr>
+            </w:pPr>
+            <w:r>
+              <w:rPr>
+                <w:i w:val="0"/>
+                <w:iCs w:val="0"/>
+              </w:rPr>
               <w:lastRenderedPageBreak/>
               <w:t>&lt;</w:t>
             </w:r>
             <w:proofErr w:type="spellStart"/>
             <w:r>
+              <w:rPr>
+                <w:i w:val="0"/>
+                <w:iCs w:val="0"/>
+              </w:rPr>
               <w:t>operandoEq</w:t>
             </w:r>
             <w:proofErr w:type="spellEnd"/>
             <w:r>
+              <w:rPr>
+                <w:i w:val="0"/>
+                <w:iCs w:val="0"/>
+              </w:rPr>
               <w:t>&gt;</w:t>
             </w:r>
           </w:p>
@@ -2101,16 +2531,32 @@
           <w:p>
             <w:pPr>
               <w:spacing w:after="160" w:line="259" w:lineRule="auto"/>
-            </w:pPr>
-            <w:r>
+              <w:rPr>
+                <w:i w:val="0"/>
+                <w:iCs w:val="0"/>
+              </w:rPr>
+            </w:pPr>
+            <w:r>
+              <w:rPr>
+                <w:i w:val="0"/>
+                <w:iCs w:val="0"/>
+              </w:rPr>
               <w:t>&lt;</w:t>
             </w:r>
             <w:proofErr w:type="spellStart"/>
             <w:r>
+              <w:rPr>
+                <w:i w:val="0"/>
+                <w:iCs w:val="0"/>
+              </w:rPr>
               <w:t>exprLog</w:t>
             </w:r>
             <w:proofErr w:type="spellEnd"/>
             <w:r>
+              <w:rPr>
+                <w:i w:val="0"/>
+                <w:iCs w:val="0"/>
+              </w:rPr>
               <w:t>&gt;</w:t>
             </w:r>
           </w:p>
@@ -2144,16 +2590,32 @@
           <w:p>
             <w:pPr>
               <w:spacing w:after="160" w:line="259" w:lineRule="auto"/>
-            </w:pPr>
-            <w:r>
+              <w:rPr>
+                <w:i w:val="0"/>
+                <w:iCs w:val="0"/>
+              </w:rPr>
+            </w:pPr>
+            <w:r>
+              <w:rPr>
+                <w:i w:val="0"/>
+                <w:iCs w:val="0"/>
+              </w:rPr>
               <w:t>&lt;</w:t>
             </w:r>
             <w:proofErr w:type="spellStart"/>
             <w:r>
+              <w:rPr>
+                <w:i w:val="0"/>
+                <w:iCs w:val="0"/>
+              </w:rPr>
               <w:t>opLog</w:t>
             </w:r>
             <w:proofErr w:type="spellEnd"/>
             <w:r>
+              <w:rPr>
+                <w:i w:val="0"/>
+                <w:iCs w:val="0"/>
+              </w:rPr>
               <w:t>&gt;</w:t>
             </w:r>
           </w:p>
@@ -2184,16 +2646,32 @@
           <w:p>
             <w:pPr>
               <w:spacing w:after="160" w:line="259" w:lineRule="auto"/>
-            </w:pPr>
-            <w:r>
+              <w:rPr>
+                <w:i w:val="0"/>
+                <w:iCs w:val="0"/>
+              </w:rPr>
+            </w:pPr>
+            <w:r>
+              <w:rPr>
+                <w:i w:val="0"/>
+                <w:iCs w:val="0"/>
+              </w:rPr>
               <w:t>&lt;</w:t>
             </w:r>
             <w:proofErr w:type="spellStart"/>
             <w:r>
+              <w:rPr>
+                <w:i w:val="0"/>
+                <w:iCs w:val="0"/>
+              </w:rPr>
               <w:t>expresion</w:t>
             </w:r>
             <w:proofErr w:type="spellEnd"/>
             <w:r>
+              <w:rPr>
+                <w:i w:val="0"/>
+                <w:iCs w:val="0"/>
+              </w:rPr>
               <w:t>&gt;</w:t>
             </w:r>
           </w:p>
@@ -2227,8 +2705,16 @@
           <w:p>
             <w:pPr>
               <w:spacing w:after="160" w:line="259" w:lineRule="auto"/>
-            </w:pPr>
-            <w:r>
+              <w:rPr>
+                <w:i w:val="0"/>
+                <w:iCs w:val="0"/>
+              </w:rPr>
+            </w:pPr>
+            <w:r>
+              <w:rPr>
+                <w:i w:val="0"/>
+                <w:iCs w:val="0"/>
+              </w:rPr>
               <w:t>&lt;sentencia&gt;</w:t>
             </w:r>
           </w:p>
@@ -2259,16 +2745,32 @@
           <w:p>
             <w:pPr>
               <w:spacing w:after="160" w:line="259" w:lineRule="auto"/>
-            </w:pPr>
-            <w:r>
+              <w:rPr>
+                <w:i w:val="0"/>
+                <w:iCs w:val="0"/>
+              </w:rPr>
+            </w:pPr>
+            <w:r>
+              <w:rPr>
+                <w:i w:val="0"/>
+                <w:iCs w:val="0"/>
+              </w:rPr>
               <w:t>&lt;</w:t>
             </w:r>
             <w:proofErr w:type="spellStart"/>
             <w:r>
+              <w:rPr>
+                <w:i w:val="0"/>
+                <w:iCs w:val="0"/>
+              </w:rPr>
               <w:t>asignacion</w:t>
             </w:r>
             <w:proofErr w:type="spellEnd"/>
             <w:r>
+              <w:rPr>
+                <w:i w:val="0"/>
+                <w:iCs w:val="0"/>
+              </w:rPr>
               <w:t>&gt;</w:t>
             </w:r>
           </w:p>
@@ -2302,16 +2804,32 @@
           <w:p>
             <w:pPr>
               <w:spacing w:after="160" w:line="259" w:lineRule="auto"/>
-            </w:pPr>
-            <w:r>
+              <w:rPr>
+                <w:i w:val="0"/>
+                <w:iCs w:val="0"/>
+              </w:rPr>
+            </w:pPr>
+            <w:r>
+              <w:rPr>
+                <w:i w:val="0"/>
+                <w:iCs w:val="0"/>
+              </w:rPr>
               <w:t>&lt;</w:t>
             </w:r>
             <w:proofErr w:type="spellStart"/>
             <w:r>
+              <w:rPr>
+                <w:i w:val="0"/>
+                <w:iCs w:val="0"/>
+              </w:rPr>
               <w:t>if</w:t>
             </w:r>
             <w:proofErr w:type="spellEnd"/>
             <w:r>
+              <w:rPr>
+                <w:i w:val="0"/>
+                <w:iCs w:val="0"/>
+              </w:rPr>
               <w:t>&gt;</w:t>
             </w:r>
           </w:p>
@@ -2342,16 +2860,32 @@
           <w:p>
             <w:pPr>
               <w:spacing w:after="160" w:line="259" w:lineRule="auto"/>
-            </w:pPr>
-            <w:r>
+              <w:rPr>
+                <w:i w:val="0"/>
+                <w:iCs w:val="0"/>
+              </w:rPr>
+            </w:pPr>
+            <w:r>
+              <w:rPr>
+                <w:i w:val="0"/>
+                <w:iCs w:val="0"/>
+              </w:rPr>
               <w:t>&lt;</w:t>
             </w:r>
             <w:proofErr w:type="spellStart"/>
             <w:r>
+              <w:rPr>
+                <w:i w:val="0"/>
+                <w:iCs w:val="0"/>
+              </w:rPr>
               <w:t>elifOpc</w:t>
             </w:r>
             <w:proofErr w:type="spellEnd"/>
             <w:r>
+              <w:rPr>
+                <w:i w:val="0"/>
+                <w:iCs w:val="0"/>
+              </w:rPr>
               <w:t>&gt;</w:t>
             </w:r>
           </w:p>
@@ -2393,16 +2927,32 @@
           <w:p>
             <w:pPr>
               <w:spacing w:after="160" w:line="259" w:lineRule="auto"/>
-            </w:pPr>
-            <w:r>
+              <w:rPr>
+                <w:i w:val="0"/>
+                <w:iCs w:val="0"/>
+              </w:rPr>
+            </w:pPr>
+            <w:r>
+              <w:rPr>
+                <w:i w:val="0"/>
+                <w:iCs w:val="0"/>
+              </w:rPr>
               <w:t>&lt;</w:t>
             </w:r>
             <w:proofErr w:type="spellStart"/>
             <w:r>
+              <w:rPr>
+                <w:i w:val="0"/>
+                <w:iCs w:val="0"/>
+              </w:rPr>
               <w:t>elseOpc</w:t>
             </w:r>
             <w:proofErr w:type="spellEnd"/>
             <w:r>
+              <w:rPr>
+                <w:i w:val="0"/>
+                <w:iCs w:val="0"/>
+              </w:rPr>
               <w:t>&gt;</w:t>
             </w:r>
           </w:p>
@@ -2441,16 +2991,32 @@
           <w:p>
             <w:pPr>
               <w:spacing w:after="160" w:line="259" w:lineRule="auto"/>
-            </w:pPr>
-            <w:r>
+              <w:rPr>
+                <w:i w:val="0"/>
+                <w:iCs w:val="0"/>
+              </w:rPr>
+            </w:pPr>
+            <w:r>
+              <w:rPr>
+                <w:i w:val="0"/>
+                <w:iCs w:val="0"/>
+              </w:rPr>
               <w:t>&lt;</w:t>
             </w:r>
             <w:proofErr w:type="spellStart"/>
             <w:r>
+              <w:rPr>
+                <w:i w:val="0"/>
+                <w:iCs w:val="0"/>
+              </w:rPr>
               <w:t>elif</w:t>
             </w:r>
             <w:proofErr w:type="spellEnd"/>
             <w:r>
+              <w:rPr>
+                <w:i w:val="0"/>
+                <w:iCs w:val="0"/>
+              </w:rPr>
               <w:t>&gt;</w:t>
             </w:r>
           </w:p>
@@ -2484,16 +3050,32 @@
           <w:p>
             <w:pPr>
               <w:spacing w:after="160" w:line="259" w:lineRule="auto"/>
-            </w:pPr>
-            <w:r>
+              <w:rPr>
+                <w:i w:val="0"/>
+                <w:iCs w:val="0"/>
+              </w:rPr>
+            </w:pPr>
+            <w:r>
+              <w:rPr>
+                <w:i w:val="0"/>
+                <w:iCs w:val="0"/>
+              </w:rPr>
               <w:t>&lt;</w:t>
             </w:r>
             <w:proofErr w:type="spellStart"/>
             <w:r>
+              <w:rPr>
+                <w:i w:val="0"/>
+                <w:iCs w:val="0"/>
+              </w:rPr>
               <w:t>else</w:t>
             </w:r>
             <w:proofErr w:type="spellEnd"/>
             <w:r>
+              <w:rPr>
+                <w:i w:val="0"/>
+                <w:iCs w:val="0"/>
+              </w:rPr>
               <w:t>&gt;</w:t>
             </w:r>
           </w:p>
@@ -2524,16 +3106,32 @@
           <w:p>
             <w:pPr>
               <w:spacing w:after="160" w:line="259" w:lineRule="auto"/>
-            </w:pPr>
-            <w:r>
+              <w:rPr>
+                <w:i w:val="0"/>
+                <w:iCs w:val="0"/>
+              </w:rPr>
+            </w:pPr>
+            <w:r>
+              <w:rPr>
+                <w:i w:val="0"/>
+                <w:iCs w:val="0"/>
+              </w:rPr>
               <w:t>&lt;</w:t>
             </w:r>
             <w:proofErr w:type="spellStart"/>
             <w:r>
+              <w:rPr>
+                <w:i w:val="0"/>
+                <w:iCs w:val="0"/>
+              </w:rPr>
               <w:t>condicion</w:t>
             </w:r>
             <w:proofErr w:type="spellEnd"/>
             <w:r>
+              <w:rPr>
+                <w:i w:val="0"/>
+                <w:iCs w:val="0"/>
+              </w:rPr>
               <w:t>&gt;</w:t>
             </w:r>
           </w:p>
@@ -2567,8 +3165,16 @@
           <w:p>
             <w:pPr>
               <w:spacing w:after="160" w:line="259" w:lineRule="auto"/>
-            </w:pPr>
-            <w:r>
+              <w:rPr>
+                <w:i w:val="0"/>
+                <w:iCs w:val="0"/>
+              </w:rPr>
+            </w:pPr>
+            <w:r>
+              <w:rPr>
+                <w:i w:val="0"/>
+                <w:iCs w:val="0"/>
+              </w:rPr>
               <w:t>&lt;bloque&gt;</w:t>
             </w:r>
           </w:p>
@@ -2599,16 +3205,32 @@
           <w:p>
             <w:pPr>
               <w:spacing w:after="160" w:line="259" w:lineRule="auto"/>
-            </w:pPr>
-            <w:r>
+              <w:rPr>
+                <w:i w:val="0"/>
+                <w:iCs w:val="0"/>
+              </w:rPr>
+            </w:pPr>
+            <w:r>
+              <w:rPr>
+                <w:i w:val="0"/>
+                <w:iCs w:val="0"/>
+              </w:rPr>
               <w:t>&lt;</w:t>
             </w:r>
             <w:proofErr w:type="spellStart"/>
             <w:r>
+              <w:rPr>
+                <w:i w:val="0"/>
+                <w:iCs w:val="0"/>
+              </w:rPr>
               <w:t>lineaBloque</w:t>
             </w:r>
             <w:proofErr w:type="spellEnd"/>
             <w:r>
+              <w:rPr>
+                <w:i w:val="0"/>
+                <w:iCs w:val="0"/>
+              </w:rPr>
               <w:t>&gt;</w:t>
             </w:r>
           </w:p>
@@ -2642,16 +3264,32 @@
           <w:p>
             <w:pPr>
               <w:spacing w:after="160" w:line="259" w:lineRule="auto"/>
-            </w:pPr>
-            <w:r>
+              <w:rPr>
+                <w:i w:val="0"/>
+                <w:iCs w:val="0"/>
+              </w:rPr>
+            </w:pPr>
+            <w:r>
+              <w:rPr>
+                <w:i w:val="0"/>
+                <w:iCs w:val="0"/>
+              </w:rPr>
               <w:t>&lt;</w:t>
             </w:r>
             <w:proofErr w:type="spellStart"/>
             <w:r>
+              <w:rPr>
+                <w:i w:val="0"/>
+                <w:iCs w:val="0"/>
+              </w:rPr>
               <w:t>estructuraControl</w:t>
             </w:r>
             <w:proofErr w:type="spellEnd"/>
             <w:r>
+              <w:rPr>
+                <w:i w:val="0"/>
+                <w:iCs w:val="0"/>
+              </w:rPr>
               <w:t>&gt;</w:t>
             </w:r>
           </w:p>
@@ -2682,16 +3320,32 @@
           <w:p>
             <w:pPr>
               <w:spacing w:after="160" w:line="259" w:lineRule="auto"/>
-            </w:pPr>
-            <w:r>
+              <w:rPr>
+                <w:i w:val="0"/>
+                <w:iCs w:val="0"/>
+              </w:rPr>
+            </w:pPr>
+            <w:r>
+              <w:rPr>
+                <w:i w:val="0"/>
+                <w:iCs w:val="0"/>
+              </w:rPr>
               <w:t>&lt;</w:t>
             </w:r>
             <w:proofErr w:type="spellStart"/>
             <w:r>
+              <w:rPr>
+                <w:i w:val="0"/>
+                <w:iCs w:val="0"/>
+              </w:rPr>
               <w:t>while</w:t>
             </w:r>
             <w:proofErr w:type="spellEnd"/>
             <w:r>
+              <w:rPr>
+                <w:i w:val="0"/>
+                <w:iCs w:val="0"/>
+              </w:rPr>
               <w:t>&gt;</w:t>
             </w:r>
           </w:p>
@@ -2730,16 +3384,32 @@
           <w:p>
             <w:pPr>
               <w:spacing w:after="160" w:line="259" w:lineRule="auto"/>
-            </w:pPr>
-            <w:r>
+              <w:rPr>
+                <w:i w:val="0"/>
+                <w:iCs w:val="0"/>
+              </w:rPr>
+            </w:pPr>
+            <w:r>
+              <w:rPr>
+                <w:i w:val="0"/>
+                <w:iCs w:val="0"/>
+              </w:rPr>
               <w:t>&lt;</w:t>
             </w:r>
             <w:proofErr w:type="spellStart"/>
             <w:r>
+              <w:rPr>
+                <w:i w:val="0"/>
+                <w:iCs w:val="0"/>
+              </w:rPr>
               <w:t>for</w:t>
             </w:r>
             <w:proofErr w:type="spellEnd"/>
             <w:r>
+              <w:rPr>
+                <w:i w:val="0"/>
+                <w:iCs w:val="0"/>
+              </w:rPr>
               <w:t>&gt;</w:t>
             </w:r>
           </w:p>
@@ -2775,16 +3445,32 @@
           <w:p>
             <w:pPr>
               <w:spacing w:after="160" w:line="259" w:lineRule="auto"/>
-            </w:pPr>
-            <w:r>
+              <w:rPr>
+                <w:i w:val="0"/>
+                <w:iCs w:val="0"/>
+              </w:rPr>
+            </w:pPr>
+            <w:r>
+              <w:rPr>
+                <w:i w:val="0"/>
+                <w:iCs w:val="0"/>
+              </w:rPr>
               <w:t>&lt;</w:t>
             </w:r>
             <w:proofErr w:type="spellStart"/>
             <w:r>
+              <w:rPr>
+                <w:i w:val="0"/>
+                <w:iCs w:val="0"/>
+              </w:rPr>
               <w:t>condicionFor</w:t>
             </w:r>
             <w:proofErr w:type="spellEnd"/>
             <w:r>
+              <w:rPr>
+                <w:i w:val="0"/>
+                <w:iCs w:val="0"/>
+              </w:rPr>
               <w:t>&gt;</w:t>
             </w:r>
           </w:p>
@@ -2823,16 +3509,32 @@
           <w:p>
             <w:pPr>
               <w:spacing w:after="160" w:line="259" w:lineRule="auto"/>
-            </w:pPr>
-            <w:r>
+              <w:rPr>
+                <w:i w:val="0"/>
+                <w:iCs w:val="0"/>
+              </w:rPr>
+            </w:pPr>
+            <w:r>
+              <w:rPr>
+                <w:i w:val="0"/>
+                <w:iCs w:val="0"/>
+              </w:rPr>
               <w:t>&lt;</w:t>
             </w:r>
             <w:proofErr w:type="spellStart"/>
             <w:r>
+              <w:rPr>
+                <w:i w:val="0"/>
+                <w:iCs w:val="0"/>
+              </w:rPr>
               <w:t>return</w:t>
             </w:r>
             <w:proofErr w:type="spellEnd"/>
             <w:r>
+              <w:rPr>
+                <w:i w:val="0"/>
+                <w:iCs w:val="0"/>
+              </w:rPr>
               <w:t>&gt;</w:t>
             </w:r>
           </w:p>
@@ -2863,8 +3565,16 @@
           <w:p>
             <w:pPr>
               <w:spacing w:after="160" w:line="259" w:lineRule="auto"/>
-            </w:pPr>
-            <w:r>
+              <w:rPr>
+                <w:i w:val="0"/>
+                <w:iCs w:val="0"/>
+              </w:rPr>
+            </w:pPr>
+            <w:r>
+              <w:rPr>
+                <w:i w:val="0"/>
+                <w:iCs w:val="0"/>
+              </w:rPr>
               <w:t>&lt;break&gt;</w:t>
             </w:r>
           </w:p>
@@ -2898,16 +3608,32 @@
           <w:p>
             <w:pPr>
               <w:spacing w:after="160" w:line="259" w:lineRule="auto"/>
-            </w:pPr>
-            <w:r>
+              <w:rPr>
+                <w:i w:val="0"/>
+                <w:iCs w:val="0"/>
+              </w:rPr>
+            </w:pPr>
+            <w:r>
+              <w:rPr>
+                <w:i w:val="0"/>
+                <w:iCs w:val="0"/>
+              </w:rPr>
               <w:t>&lt;</w:t>
             </w:r>
             <w:proofErr w:type="spellStart"/>
             <w:r>
+              <w:rPr>
+                <w:i w:val="0"/>
+                <w:iCs w:val="0"/>
+              </w:rPr>
               <w:t>write</w:t>
             </w:r>
             <w:proofErr w:type="spellEnd"/>
             <w:r>
+              <w:rPr>
+                <w:i w:val="0"/>
+                <w:iCs w:val="0"/>
+              </w:rPr>
               <w:t>&gt;</w:t>
             </w:r>
           </w:p>
@@ -2938,16 +3664,32 @@
           <w:p>
             <w:pPr>
               <w:spacing w:after="160" w:line="259" w:lineRule="auto"/>
-            </w:pPr>
-            <w:r>
+              <w:rPr>
+                <w:i w:val="0"/>
+                <w:iCs w:val="0"/>
+              </w:rPr>
+            </w:pPr>
+            <w:r>
+              <w:rPr>
+                <w:i w:val="0"/>
+                <w:iCs w:val="0"/>
+              </w:rPr>
               <w:t>&lt;</w:t>
             </w:r>
             <w:proofErr w:type="spellStart"/>
             <w:r>
+              <w:rPr>
+                <w:i w:val="0"/>
+                <w:iCs w:val="0"/>
+              </w:rPr>
               <w:t>paramWrite</w:t>
             </w:r>
             <w:proofErr w:type="spellEnd"/>
             <w:r>
+              <w:rPr>
+                <w:i w:val="0"/>
+                <w:iCs w:val="0"/>
+              </w:rPr>
               <w:t>&gt;</w:t>
             </w:r>
           </w:p>
@@ -2986,16 +3728,32 @@
           <w:p>
             <w:pPr>
               <w:spacing w:after="160" w:line="259" w:lineRule="auto"/>
-            </w:pPr>
-            <w:r>
+              <w:rPr>
+                <w:i w:val="0"/>
+                <w:iCs w:val="0"/>
+              </w:rPr>
+            </w:pPr>
+            <w:r>
+              <w:rPr>
+                <w:i w:val="0"/>
+                <w:iCs w:val="0"/>
+              </w:rPr>
               <w:t>&lt;</w:t>
             </w:r>
             <w:proofErr w:type="spellStart"/>
             <w:r>
+              <w:rPr>
+                <w:i w:val="0"/>
+                <w:iCs w:val="0"/>
+              </w:rPr>
               <w:t>read</w:t>
             </w:r>
             <w:proofErr w:type="spellEnd"/>
             <w:r>
+              <w:rPr>
+                <w:i w:val="0"/>
+                <w:iCs w:val="0"/>
+              </w:rPr>
               <w:t>&gt;</w:t>
             </w:r>
           </w:p>
@@ -3026,16 +3784,32 @@
           <w:p>
             <w:pPr>
               <w:spacing w:after="160" w:line="259" w:lineRule="auto"/>
-            </w:pPr>
-            <w:r>
+              <w:rPr>
+                <w:i w:val="0"/>
+                <w:iCs w:val="0"/>
+              </w:rPr>
+            </w:pPr>
+            <w:r>
+              <w:rPr>
+                <w:i w:val="0"/>
+                <w:iCs w:val="0"/>
+              </w:rPr>
               <w:t>&lt;</w:t>
             </w:r>
             <w:proofErr w:type="spellStart"/>
             <w:r>
+              <w:rPr>
+                <w:i w:val="0"/>
+                <w:iCs w:val="0"/>
+              </w:rPr>
               <w:t>funcion</w:t>
             </w:r>
             <w:proofErr w:type="spellEnd"/>
             <w:r>
+              <w:rPr>
+                <w:i w:val="0"/>
+                <w:iCs w:val="0"/>
+              </w:rPr>
               <w:t>&gt;</w:t>
             </w:r>
           </w:p>
@@ -3069,16 +3843,32 @@
           <w:p>
             <w:pPr>
               <w:spacing w:after="160" w:line="259" w:lineRule="auto"/>
-            </w:pPr>
-            <w:r>
+              <w:rPr>
+                <w:i w:val="0"/>
+                <w:iCs w:val="0"/>
+              </w:rPr>
+            </w:pPr>
+            <w:r>
+              <w:rPr>
+                <w:i w:val="0"/>
+                <w:iCs w:val="0"/>
+              </w:rPr>
               <w:t>&lt;</w:t>
             </w:r>
             <w:proofErr w:type="spellStart"/>
             <w:r>
+              <w:rPr>
+                <w:i w:val="0"/>
+                <w:iCs w:val="0"/>
+              </w:rPr>
               <w:t>params</w:t>
             </w:r>
             <w:proofErr w:type="spellEnd"/>
             <w:r>
+              <w:rPr>
+                <w:i w:val="0"/>
+                <w:iCs w:val="0"/>
+              </w:rPr>
               <w:t>&gt;</w:t>
             </w:r>
           </w:p>
@@ -3109,16 +3899,32 @@
           <w:p>
             <w:pPr>
               <w:spacing w:after="160" w:line="259" w:lineRule="auto"/>
-            </w:pPr>
-            <w:r>
+              <w:rPr>
+                <w:i w:val="0"/>
+                <w:iCs w:val="0"/>
+              </w:rPr>
+            </w:pPr>
+            <w:r>
+              <w:rPr>
+                <w:i w:val="0"/>
+                <w:iCs w:val="0"/>
+              </w:rPr>
               <w:t>&lt;</w:t>
             </w:r>
             <w:proofErr w:type="spellStart"/>
             <w:r>
+              <w:rPr>
+                <w:i w:val="0"/>
+                <w:iCs w:val="0"/>
+              </w:rPr>
               <w:t>paramFun</w:t>
             </w:r>
             <w:proofErr w:type="spellEnd"/>
             <w:r>
+              <w:rPr>
+                <w:i w:val="0"/>
+                <w:iCs w:val="0"/>
+              </w:rPr>
               <w:t>&gt;</w:t>
             </w:r>
           </w:p>
@@ -3152,16 +3958,32 @@
           <w:p>
             <w:pPr>
               <w:spacing w:after="160" w:line="259" w:lineRule="auto"/>
-            </w:pPr>
-            <w:r>
+              <w:rPr>
+                <w:i w:val="0"/>
+                <w:iCs w:val="0"/>
+              </w:rPr>
+            </w:pPr>
+            <w:r>
+              <w:rPr>
+                <w:i w:val="0"/>
+                <w:iCs w:val="0"/>
+              </w:rPr>
               <w:t>&lt;</w:t>
             </w:r>
             <w:proofErr w:type="spellStart"/>
             <w:r>
+              <w:rPr>
+                <w:i w:val="0"/>
+                <w:iCs w:val="0"/>
+              </w:rPr>
               <w:t>llamadaFun</w:t>
             </w:r>
             <w:proofErr w:type="spellEnd"/>
             <w:r>
+              <w:rPr>
+                <w:i w:val="0"/>
+                <w:iCs w:val="0"/>
+              </w:rPr>
               <w:t>&gt;</w:t>
             </w:r>
           </w:p>
@@ -3192,16 +4014,32 @@
           <w:p>
             <w:pPr>
               <w:spacing w:after="160" w:line="259" w:lineRule="auto"/>
-            </w:pPr>
-            <w:r>
+              <w:rPr>
+                <w:i w:val="0"/>
+                <w:iCs w:val="0"/>
+              </w:rPr>
+            </w:pPr>
+            <w:r>
+              <w:rPr>
+                <w:i w:val="0"/>
+                <w:iCs w:val="0"/>
+              </w:rPr>
               <w:t>&lt;</w:t>
             </w:r>
             <w:proofErr w:type="spellStart"/>
             <w:r>
+              <w:rPr>
+                <w:i w:val="0"/>
+                <w:iCs w:val="0"/>
+              </w:rPr>
               <w:t>args</w:t>
             </w:r>
             <w:proofErr w:type="spellEnd"/>
             <w:r>
+              <w:rPr>
+                <w:i w:val="0"/>
+                <w:iCs w:val="0"/>
+              </w:rPr>
               <w:t>&gt;</w:t>
             </w:r>
           </w:p>
@@ -3235,8 +4073,16 @@
           <w:p>
             <w:pPr>
               <w:spacing w:after="160" w:line="259" w:lineRule="auto"/>
-            </w:pPr>
-            <w:r>
+              <w:rPr>
+                <w:i w:val="0"/>
+                <w:iCs w:val="0"/>
+              </w:rPr>
+            </w:pPr>
+            <w:r>
+              <w:rPr>
+                <w:i w:val="0"/>
+                <w:iCs w:val="0"/>
+              </w:rPr>
               <w:lastRenderedPageBreak/>
               <w:t>&lt;principal&gt;</w:t>
             </w:r>
@@ -3268,8 +4114,16 @@
           <w:p>
             <w:pPr>
               <w:spacing w:after="160" w:line="259" w:lineRule="auto"/>
-            </w:pPr>
-            <w:r>
+              <w:rPr>
+                <w:i w:val="0"/>
+                <w:iCs w:val="0"/>
+              </w:rPr>
+            </w:pPr>
+            <w:r>
+              <w:rPr>
+                <w:i w:val="0"/>
+                <w:iCs w:val="0"/>
+              </w:rPr>
               <w:t>&lt;comentario&gt;</w:t>
             </w:r>
           </w:p>
@@ -3361,7 +4215,28 @@
           <w:sz w:val="24"/>
           <w:szCs w:val="24"/>
         </w:rPr>
-        <w:t>La importancia de definir correctamente los niveles de precedencia en expresiones aritméticas mediante producciones separadas.</w:t>
+        <w:t>La importancia de definir correctamente los niveles de precedencia en expresiones aritméticas mediante producciones separada</w:t>
+      </w:r>
+      <w:r>
+        <w:rPr>
+          <w:sz w:val="24"/>
+          <w:szCs w:val="24"/>
+        </w:rPr>
+        <w:t xml:space="preserve">s, esto para poder evitar confusiones o </w:t>
+      </w:r>
+      <w:r>
+        <w:rPr>
+          <w:sz w:val="24"/>
+          <w:szCs w:val="24"/>
+        </w:rPr>
+        <w:t>ambigüedades</w:t>
+      </w:r>
+      <w:r>
+        <w:rPr>
+          <w:sz w:val="24"/>
+          <w:szCs w:val="24"/>
+        </w:rPr>
+        <w:t>.</w:t>
       </w:r>
     </w:p>
     <w:p>
@@ -3688,10 +4563,10 @@
     <w:p>
       <w:r>
         <w:drawing>
-          <wp:inline distT="0" distB="0" distL="0" distR="0" wp14:anchorId="684BDA40" wp14:editId="4100B6DF">
-            <wp:extent cx="5612130" cy="2660650"/>
-            <wp:effectExtent l="0" t="0" r="7620" b="6350"/>
-            <wp:docPr id="2096557967" name="Imagen 1"/>
+          <wp:inline distT="0" distB="0" distL="0" distR="0" wp14:anchorId="17D1DCE9" wp14:editId="29D8B121">
+            <wp:extent cx="5612130" cy="3228975"/>
+            <wp:effectExtent l="0" t="0" r="7620" b="9525"/>
+            <wp:docPr id="2107544578" name="Imagen 1"/>
             <wp:cNvGraphicFramePr>
               <a:graphicFrameLocks xmlns:a="http://schemas.openxmlformats.org/drawingml/2006/main" noChangeAspect="1"/>
             </wp:cNvGraphicFramePr>
@@ -3699,11 +4574,11 @@
               <a:graphicData uri="http://schemas.openxmlformats.org/drawingml/2006/picture">
                 <pic:pic xmlns:pic="http://schemas.openxmlformats.org/drawingml/2006/picture">
                   <pic:nvPicPr>
-                    <pic:cNvPr id="2096557967" name=""/>
+                    <pic:cNvPr id="2107544578" name=""/>
                     <pic:cNvPicPr/>
                   </pic:nvPicPr>
                   <pic:blipFill>
-                    <a:blip r:embed="rId5"/>
+                    <a:blip r:embed="rId7"/>
                     <a:stretch>
                       <a:fillRect/>
                     </a:stretch>
@@ -3711,7 +4586,7 @@
                   <pic:spPr>
                     <a:xfrm>
                       <a:off x="0" y="0"/>
-                      <a:ext cx="5612130" cy="2660650"/>
+                      <a:ext cx="5612130" cy="3228975"/>
                     </a:xfrm>
                     <a:prstGeom prst="rect">
                       <a:avLst/>
@@ -3726,7 +4601,7 @@
     </w:p>
     <w:p/>
     <w:sectPr>
-      <w:headerReference w:type="default" r:id="rId6"/>
+      <w:headerReference w:type="default" r:id="rId8"/>
       <w:pgSz w:w="12240" w:h="15840"/>
       <w:pgMar w:top="1417" w:right="1701" w:bottom="1417" w:left="1701" w:header="708" w:footer="708" w:gutter="0"/>
       <w:cols w:space="708"/>
@@ -3734,6 +4609,56 @@
     </w:sectPr>
   </w:body>
 </w:document>
+</file>
+
+<file path=word/endnotes.xml><?xml version="1.0" encoding="utf-8"?>
+<w:endnotes xmlns:wpc="http://schemas.microsoft.com/office/word/2010/wordprocessingCanvas" xmlns:cx="http://schemas.microsoft.com/office/drawing/2014/chartex" xmlns:cx1="http://schemas.microsoft.com/office/drawing/2015/9/8/chartex" xmlns:cx2="http://schemas.microsoft.com/office/drawing/2015/10/21/chartex" xmlns:cx3="http://schemas.microsoft.com/office/drawing/2016/5/9/chartex" xmlns:cx4="http://schemas.microsoft.com/office/drawing/2016/5/10/chartex" xmlns:cx5="http://schemas.microsoft.com/office/drawing/2016/5/11/chartex" xmlns:cx6="http://schemas.microsoft.com/office/drawing/2016/5/12/chartex" xmlns:cx7="http://schemas.microsoft.com/office/drawing/2016/5/13/chartex" xmlns:cx8="http://schemas.microsoft.com/office/drawing/2016/5/14/chartex" xmlns:mc="http://schemas.openxmlformats.org/markup-compatibility/2006" xmlns:aink="http://schemas.microsoft.com/office/drawing/2016/ink" xmlns:am3d="http://schemas.microsoft.com/office/drawing/2017/model3d" xmlns:o="urn:schemas-microsoft-com:office:office" xmlns:oel="http://schemas.microsoft.com/office/2019/extlst" xmlns:r="http://schemas.openxmlformats.org/officeDocument/2006/relationships" xmlns:m="http://schemas.openxmlformats.org/officeDocument/2006/math" xmlns:v="urn:schemas-microsoft-com:vml" xmlns:wp14="http://schemas.microsoft.com/office/word/2010/wordprocessingDrawing" xmlns:wp="http://schemas.openxmlformats.org/drawingml/2006/wordprocessingDrawing" xmlns:w10="urn:schemas-microsoft-com:office:word" xmlns:w="http://schemas.openxmlformats.org/wordprocessingml/2006/main" xmlns:w14="http://schemas.microsoft.com/office/word/2010/wordml" xmlns:w15="http://schemas.microsoft.com/office/word/2012/wordml" xmlns:w16cex="http://schemas.microsoft.com/office/word/2018/wordml/cex" xmlns:w16cid="http://schemas.microsoft.com/office/word/2016/wordml/cid" xmlns:w16="http://schemas.microsoft.com/office/word/2018/wordml" xmlns:w16du="http://schemas.microsoft.com/office/word/2023/wordml/word16du" xmlns:w16sdtdh="http://schemas.microsoft.com/office/word/2020/wordml/sdtdatahash" xmlns:w16sdtfl="http://schemas.microsoft.com/office/word/2024/wordml/sdtformatlock" xmlns:w16se="http://schemas.microsoft.com/office/word/2015/wordml/symex" xmlns:wpg="http://schemas.microsoft.com/office/word/2010/wordprocessingGroup" xmlns:wpi="http://schemas.microsoft.com/office/word/2010/wordprocessingInk" xmlns:wne="http://schemas.microsoft.com/office/word/2006/wordml" xmlns:wps="http://schemas.microsoft.com/office/word/2010/wordprocessingShape" mc:Ignorable="w14 w15 w16se w16cid w16 w16cex w16sdtdh w16sdtfl w16du wp14">
+  <w:endnote w:type="separator" w:id="-1">
+    <w:p>
+      <w:pPr>
+        <w:spacing w:after="0" w:line="240" w:lineRule="auto"/>
+      </w:pPr>
+      <w:r>
+        <w:separator/>
+      </w:r>
+    </w:p>
+  </w:endnote>
+  <w:endnote w:type="continuationSeparator" w:id="0">
+    <w:p>
+      <w:pPr>
+        <w:spacing w:after="0" w:line="240" w:lineRule="auto"/>
+      </w:pPr>
+      <w:r>
+        <w:continuationSeparator/>
+      </w:r>
+    </w:p>
+  </w:endnote>
+</w:endnotes>
+</file>
+
+<file path=word/footnotes.xml><?xml version="1.0" encoding="utf-8"?>
+<w:footnotes xmlns:wpc="http://schemas.microsoft.com/office/word/2010/wordprocessingCanvas" xmlns:cx="http://schemas.microsoft.com/office/drawing/2014/chartex" xmlns:cx1="http://schemas.microsoft.com/office/drawing/2015/9/8/chartex" xmlns:cx2="http://schemas.microsoft.com/office/drawing/2015/10/21/chartex" xmlns:cx3="http://schemas.microsoft.com/office/drawing/2016/5/9/chartex" xmlns:cx4="http://schemas.microsoft.com/office/drawing/2016/5/10/chartex" xmlns:cx5="http://schemas.microsoft.com/office/drawing/2016/5/11/chartex" xmlns:cx6="http://schemas.microsoft.com/office/drawing/2016/5/12/chartex" xmlns:cx7="http://schemas.microsoft.com/office/drawing/2016/5/13/chartex" xmlns:cx8="http://schemas.microsoft.com/office/drawing/2016/5/14/chartex" xmlns:mc="http://schemas.openxmlformats.org/markup-compatibility/2006" xmlns:aink="http://schemas.microsoft.com/office/drawing/2016/ink" xmlns:am3d="http://schemas.microsoft.com/office/drawing/2017/model3d" xmlns:o="urn:schemas-microsoft-com:office:office" xmlns:oel="http://schemas.microsoft.com/office/2019/extlst" xmlns:r="http://schemas.openxmlformats.org/officeDocument/2006/relationships" xmlns:m="http://schemas.openxmlformats.org/officeDocument/2006/math" xmlns:v="urn:schemas-microsoft-com:vml" xmlns:wp14="http://schemas.microsoft.com/office/word/2010/wordprocessingDrawing" xmlns:wp="http://schemas.openxmlformats.org/drawingml/2006/wordprocessingDrawing" xmlns:w10="urn:schemas-microsoft-com:office:word" xmlns:w="http://schemas.openxmlformats.org/wordprocessingml/2006/main" xmlns:w14="http://schemas.microsoft.com/office/word/2010/wordml" xmlns:w15="http://schemas.microsoft.com/office/word/2012/wordml" xmlns:w16cex="http://schemas.microsoft.com/office/word/2018/wordml/cex" xmlns:w16cid="http://schemas.microsoft.com/office/word/2016/wordml/cid" xmlns:w16="http://schemas.microsoft.com/office/word/2018/wordml" xmlns:w16du="http://schemas.microsoft.com/office/word/2023/wordml/word16du" xmlns:w16sdtdh="http://schemas.microsoft.com/office/word/2020/wordml/sdtdatahash" xmlns:w16sdtfl="http://schemas.microsoft.com/office/word/2024/wordml/sdtformatlock" xmlns:w16se="http://schemas.microsoft.com/office/word/2015/wordml/symex" xmlns:wpg="http://schemas.microsoft.com/office/word/2010/wordprocessingGroup" xmlns:wpi="http://schemas.microsoft.com/office/word/2010/wordprocessingInk" xmlns:wne="http://schemas.microsoft.com/office/word/2006/wordml" xmlns:wps="http://schemas.microsoft.com/office/word/2010/wordprocessingShape" mc:Ignorable="w14 w15 w16se w16cid w16 w16cex w16sdtdh w16sdtfl w16du wp14">
+  <w:footnote w:type="separator" w:id="-1">
+    <w:p>
+      <w:pPr>
+        <w:spacing w:after="0" w:line="240" w:lineRule="auto"/>
+      </w:pPr>
+      <w:r>
+        <w:separator/>
+      </w:r>
+    </w:p>
+  </w:footnote>
+  <w:footnote w:type="continuationSeparator" w:id="0">
+    <w:p>
+      <w:pPr>
+        <w:spacing w:after="0" w:line="240" w:lineRule="auto"/>
+      </w:pPr>
+      <w:r>
+        <w:continuationSeparator/>
+      </w:r>
+    </w:p>
+  </w:footnote>
+</w:footnotes>
 </file>
 
 <file path=word/header1.xml><?xml version="1.0" encoding="utf-8"?>

</xml_diff>